<commit_message>
ISR files: remove the related-submission sentence and the extension-run paragraph from the cover letter; shorten the manuscript's note on further runs
Co-Authored-By: Claude Sonnet 5.5 <noreply@anthropic.com>
Claude-Session: https://claude.ai/code/session_013HycsBHnRQDCEHKmLM3Rd4
</commit_message>
<xml_diff>
--- a/study1/isr/ISR_AIreview_cover_letter_v1.docx
+++ b/study1/isr/ISR_AIreview_cover_letter_v1.docx
@@ -98,23 +98,12 @@
     <w:p>
       <w:r>
         <w:rPr>
-          <w:b w:val="0"/>
-          <w:i w:val="0"/>
+          <w:b/>
         </w:rPr>
+        <w:t xml:space="preserve">Disclosures. </w:t>
       </w:r>
       <w:r>
-        <w:rPr>
-          <w:b/>
-          <w:i w:val="0"/>
-        </w:rPr>
-        <w:t>Disclosures.</w:t>
-      </w:r>
-      <w:r>
-        <w:rPr>
-          <w:b w:val="0"/>
-          <w:i w:val="0"/>
-        </w:rPr>
-        <w:t xml:space="preserve"> The manuscript is original, is not under consideration elsewhere, and has been prepared for double-anonymous review. No human participants were recruited. The authors have a separate manuscript under review at this journal on an unrelated question; the two share no data, items, or analyses. The paper discloses its departures from the registered plan, including a defect in one domain of the frozen item bank and the omission of a planned blind review of the keys. Two registered extension runs (wording robustness, and three further model families) were collected after the analyses reported here and are not analyzed in this version; we will report them in full in a revision if invited.</w:t>
+        <w:t>The manuscript is original, is not under consideration elsewhere, and has been prepared for double-anonymous review. No human participants were recruited. The paper discloses its departures from the registered plan, including a defect in one domain of the frozen item bank and the omission of a planned blind review of the keys.</w:t>
       </w:r>
     </w:p>
     <w:p>

</xml_diff>

<commit_message>
ISR files: author information (Ook Lee, Department of Information Systems, Hanyang University)
Co-Authored-By: Claude Sonnet 5.5 <noreply@anthropic.com>
Claude-Session: https://claude.ai/code/session_013HycsBHnRQDCEHKmLM3Rd4
</commit_message>
<xml_diff>
--- a/study1/isr/ISR_AIreview_cover_letter_v1.docx
+++ b/study1/isr/ISR_AIreview_cover_letter_v1.docx
@@ -117,15 +117,13 @@
     </w:p>
     <w:p>
       <w:r>
-        <w:rPr>
-          <w:b w:val="0"/>
-          <w:i w:val="0"/>
-        </w:rPr>
         <w:t>Sincerely,</w:t>
         <w:br/>
-        <w:t>Ook Lee (corresponding author) and co-authors (to be confirmed)</w:t>
+        <w:t>Ook Lee</w:t>
         <w:br/>
-        <w:t>Hanyang University</w:t>
+        <w:t>Department of Information Systems, Hanyang University, Seoul, Korea</w:t>
+        <w:br/>
+        <w:t>ooklee@hanyang.ac.kr</w:t>
       </w:r>
     </w:p>
     <w:sectPr>

</xml_diff>